<commit_message>
[L 1.1] | Update
- The methodology for developing the program is indicated
</commit_message>
<xml_diff>
--- a/L1.1/L1.1.docx
+++ b/L1.1/L1.1.docx
@@ -474,7 +474,7 @@
           <w:r>
             <w:fldChar w:fldCharType="separate"/>
           </w:r>
-          <w:hyperlink w:anchor="_Toc223211668" w:history="1">
+          <w:hyperlink w:anchor="_Toc223784831" w:history="1">
             <w:r>
               <w:rPr>
                 <w:rStyle w:val="a6"/>
@@ -497,7 +497,7 @@
               <w:rPr>
                 <w:webHidden/>
               </w:rPr>
-              <w:instrText xml:space="preserve"> PAGEREF _Toc223211668 \h </w:instrText>
+              <w:instrText xml:space="preserve"> PAGEREF _Toc223784831 \h </w:instrText>
             </w:r>
             <w:r>
               <w:rPr>
@@ -537,7 +537,7 @@
               <w:lang w:eastAsia="ru-RU"/>
             </w:rPr>
           </w:pPr>
-          <w:hyperlink w:anchor="_Toc223211669" w:history="1">
+          <w:hyperlink w:anchor="_Toc223784832" w:history="1">
             <w:r>
               <w:rPr>
                 <w:rStyle w:val="a6"/>
@@ -566,7 +566,7 @@
                 <w:noProof/>
                 <w:webHidden/>
               </w:rPr>
-              <w:instrText xml:space="preserve"> PAGEREF _Toc223211669 \h </w:instrText>
+              <w:instrText xml:space="preserve"> PAGEREF _Toc223784832 \h </w:instrText>
             </w:r>
             <w:r>
               <w:rPr>
@@ -610,7 +610,7 @@
               <w:lang w:eastAsia="ru-RU"/>
             </w:rPr>
           </w:pPr>
-          <w:hyperlink w:anchor="_Toc223211670" w:history="1">
+          <w:hyperlink w:anchor="_Toc223784833" w:history="1">
             <w:r>
               <w:rPr>
                 <w:rStyle w:val="a6"/>
@@ -639,7 +639,7 @@
                 <w:noProof/>
                 <w:webHidden/>
               </w:rPr>
-              <w:instrText xml:space="preserve"> PAGEREF _Toc223211670 \h </w:instrText>
+              <w:instrText xml:space="preserve"> PAGEREF _Toc223784833 \h </w:instrText>
             </w:r>
             <w:r>
               <w:rPr>
@@ -683,7 +683,7 @@
               <w:lang w:eastAsia="ru-RU"/>
             </w:rPr>
           </w:pPr>
-          <w:hyperlink w:anchor="_Toc223211671" w:history="1">
+          <w:hyperlink w:anchor="_Toc223784834" w:history="1">
             <w:r>
               <w:rPr>
                 <w:rStyle w:val="a6"/>
@@ -712,7 +712,7 @@
                 <w:noProof/>
                 <w:webHidden/>
               </w:rPr>
-              <w:instrText xml:space="preserve"> PAGEREF _Toc223211671 \h </w:instrText>
+              <w:instrText xml:space="preserve"> PAGEREF _Toc223784834 \h </w:instrText>
             </w:r>
             <w:r>
               <w:rPr>
@@ -753,7 +753,7 @@
               <w:lang w:val="ru-RU" w:eastAsia="ru-RU"/>
             </w:rPr>
           </w:pPr>
-          <w:hyperlink w:anchor="_Toc223211672" w:history="1">
+          <w:hyperlink w:anchor="_Toc223784835" w:history="1">
             <w:r>
               <w:rPr>
                 <w:rStyle w:val="a6"/>
@@ -776,7 +776,7 @@
               <w:rPr>
                 <w:webHidden/>
               </w:rPr>
-              <w:instrText xml:space="preserve"> PAGEREF _Toc223211672 \h </w:instrText>
+              <w:instrText xml:space="preserve"> PAGEREF _Toc223784835 \h </w:instrText>
             </w:r>
             <w:r>
               <w:rPr>
@@ -816,14 +816,14 @@
               <w:lang w:eastAsia="ru-RU"/>
             </w:rPr>
           </w:pPr>
-          <w:hyperlink w:anchor="_Toc223211673" w:history="1">
+          <w:hyperlink w:anchor="_Toc223784836" w:history="1">
             <w:r>
               <w:rPr>
                 <w:rStyle w:val="a6"/>
                 <w:noProof/>
                 <w:lang w:val="uk-UA"/>
               </w:rPr>
-              <w:t>Фізична/математична модель руху</w:t>
+              <w:t>Методологія розробки програмного забезпечення</w:t>
             </w:r>
             <w:r>
               <w:rPr>
@@ -844,7 +844,7 @@
                 <w:noProof/>
                 <w:webHidden/>
               </w:rPr>
-              <w:instrText xml:space="preserve"> PAGEREF _Toc223211673 \h </w:instrText>
+              <w:instrText xml:space="preserve"> PAGEREF _Toc223784836 \h </w:instrText>
             </w:r>
             <w:r>
               <w:rPr>
@@ -888,14 +888,14 @@
               <w:lang w:eastAsia="ru-RU"/>
             </w:rPr>
           </w:pPr>
-          <w:hyperlink w:anchor="_Toc223211674" w:history="1">
+          <w:hyperlink w:anchor="_Toc223784837" w:history="1">
             <w:r>
               <w:rPr>
                 <w:rStyle w:val="a6"/>
                 <w:noProof/>
                 <w:lang w:val="uk-UA"/>
               </w:rPr>
-              <w:t>Програмна реалізація алгоритму</w:t>
+              <w:t>Фізична/математична модель руху</w:t>
             </w:r>
             <w:r>
               <w:rPr>
@@ -916,7 +916,7 @@
                 <w:noProof/>
                 <w:webHidden/>
               </w:rPr>
-              <w:instrText xml:space="preserve"> PAGEREF _Toc223211674 \h </w:instrText>
+              <w:instrText xml:space="preserve"> PAGEREF _Toc223784837 \h </w:instrText>
             </w:r>
             <w:r>
               <w:rPr>
@@ -960,7 +960,79 @@
               <w:lang w:eastAsia="ru-RU"/>
             </w:rPr>
           </w:pPr>
-          <w:hyperlink w:anchor="_Toc223211675" w:history="1">
+          <w:hyperlink w:anchor="_Toc223784838" w:history="1">
+            <w:r>
+              <w:rPr>
+                <w:rStyle w:val="a6"/>
+                <w:noProof/>
+                <w:lang w:val="uk-UA"/>
+              </w:rPr>
+              <w:t>Програмна реалізація алгоритму</w:t>
+            </w:r>
+            <w:r>
+              <w:rPr>
+                <w:noProof/>
+                <w:webHidden/>
+              </w:rPr>
+              <w:tab/>
+            </w:r>
+            <w:r>
+              <w:rPr>
+                <w:noProof/>
+                <w:webHidden/>
+              </w:rPr>
+              <w:fldChar w:fldCharType="begin"/>
+            </w:r>
+            <w:r>
+              <w:rPr>
+                <w:noProof/>
+                <w:webHidden/>
+              </w:rPr>
+              <w:instrText xml:space="preserve"> PAGEREF _Toc223784838 \h </w:instrText>
+            </w:r>
+            <w:r>
+              <w:rPr>
+                <w:noProof/>
+                <w:webHidden/>
+              </w:rPr>
+            </w:r>
+            <w:r>
+              <w:rPr>
+                <w:noProof/>
+                <w:webHidden/>
+              </w:rPr>
+              <w:fldChar w:fldCharType="separate"/>
+            </w:r>
+            <w:r>
+              <w:rPr>
+                <w:noProof/>
+                <w:webHidden/>
+              </w:rPr>
+              <w:t>5</w:t>
+            </w:r>
+            <w:r>
+              <w:rPr>
+                <w:noProof/>
+                <w:webHidden/>
+              </w:rPr>
+              <w:fldChar w:fldCharType="end"/>
+            </w:r>
+          </w:hyperlink>
+        </w:p>
+        <w:p>
+          <w:pPr>
+            <w:pStyle w:val="21"/>
+            <w:tabs>
+              <w:tab w:val="right" w:leader="dot" w:pos="9345"/>
+            </w:tabs>
+            <w:rPr>
+              <w:rFonts w:asciiTheme="minorHAnsi" w:eastAsiaTheme="minorEastAsia" w:hAnsiTheme="minorHAnsi"/>
+              <w:noProof/>
+              <w:sz w:val="22"/>
+              <w:lang w:eastAsia="ru-RU"/>
+            </w:rPr>
+          </w:pPr>
+          <w:hyperlink w:anchor="_Toc223784839" w:history="1">
             <w:r>
               <w:rPr>
                 <w:rStyle w:val="a6"/>
@@ -988,7 +1060,7 @@
                 <w:noProof/>
                 <w:webHidden/>
               </w:rPr>
-              <w:instrText xml:space="preserve"> PAGEREF _Toc223211675 \h </w:instrText>
+              <w:instrText xml:space="preserve"> PAGEREF _Toc223784839 \h </w:instrText>
             </w:r>
             <w:r>
               <w:rPr>
@@ -1029,7 +1101,7 @@
               <w:lang w:val="ru-RU" w:eastAsia="ru-RU"/>
             </w:rPr>
           </w:pPr>
-          <w:hyperlink w:anchor="_Toc223211676" w:history="1">
+          <w:hyperlink w:anchor="_Toc223784840" w:history="1">
             <w:r>
               <w:rPr>
                 <w:rStyle w:val="a6"/>
@@ -1052,7 +1124,7 @@
               <w:rPr>
                 <w:webHidden/>
               </w:rPr>
-              <w:instrText xml:space="preserve"> PAGEREF _Toc223211676 \h </w:instrText>
+              <w:instrText xml:space="preserve"> PAGEREF _Toc223784840 \h </w:instrText>
             </w:r>
             <w:r>
               <w:rPr>
@@ -1069,7 +1141,7 @@
               <w:rPr>
                 <w:webHidden/>
               </w:rPr>
-              <w:t>6</w:t>
+              <w:t>7</w:t>
             </w:r>
             <w:r>
               <w:rPr>
@@ -1089,7 +1161,7 @@
               <w:lang w:val="ru-RU" w:eastAsia="ru-RU"/>
             </w:rPr>
           </w:pPr>
-          <w:hyperlink w:anchor="_Toc223211677" w:history="1">
+          <w:hyperlink w:anchor="_Toc223784841" w:history="1">
             <w:r>
               <w:rPr>
                 <w:rStyle w:val="a6"/>
@@ -1112,7 +1184,7 @@
               <w:rPr>
                 <w:webHidden/>
               </w:rPr>
-              <w:instrText xml:space="preserve"> PAGEREF _Toc223211677 \h </w:instrText>
+              <w:instrText xml:space="preserve"> PAGEREF _Toc223784841 \h </w:instrText>
             </w:r>
             <w:r>
               <w:rPr>
@@ -1129,7 +1201,7 @@
               <w:rPr>
                 <w:webHidden/>
               </w:rPr>
-              <w:t>7</w:t>
+              <w:t>8</w:t>
             </w:r>
             <w:r>
               <w:rPr>
@@ -1171,50 +1243,52 @@
           <w:docGrid w:linePitch="360"/>
         </w:sectPr>
       </w:pPr>
-    </w:p>
-    <w:p>
-      <w:pPr>
-        <w:pStyle w:val="1"/>
-        <w:rPr>
-          <w:rFonts w:cs="Times New Roman"/>
-          <w:szCs w:val="28"/>
-          <w:lang w:val="uk-UA"/>
-        </w:rPr>
-      </w:pPr>
-      <w:bookmarkStart w:id="0" w:name="_Toc223211668"/>
-      <w:r>
-        <w:rPr>
-          <w:rFonts w:cs="Times New Roman"/>
-          <w:szCs w:val="28"/>
-          <w:lang w:val="uk-UA"/>
-        </w:rPr>
-        <w:lastRenderedPageBreak/>
-        <w:t>Технічне завдання</w:t>
-      </w:r>
+      <w:bookmarkStart w:id="0" w:name="_GoBack"/>
       <w:bookmarkEnd w:id="0"/>
     </w:p>
     <w:p>
       <w:pPr>
-        <w:pStyle w:val="2"/>
+        <w:pStyle w:val="1"/>
         <w:rPr>
           <w:rFonts w:cs="Times New Roman"/>
           <w:szCs w:val="28"/>
-          <w:lang w:val="uk-UA" w:eastAsia="ru-RU"/>
-        </w:rPr>
-      </w:pPr>
-      <w:bookmarkStart w:id="1" w:name="_Toc223211669"/>
+          <w:lang w:val="uk-UA"/>
+        </w:rPr>
+      </w:pPr>
+      <w:bookmarkStart w:id="1" w:name="_Toc223784831"/>
       <w:r>
         <w:rPr>
           <w:rFonts w:cs="Times New Roman"/>
           <w:szCs w:val="28"/>
-          <w:lang w:val="uk-UA" w:eastAsia="ru-RU"/>
-        </w:rPr>
-        <w:t>Призначення</w:t>
+          <w:lang w:val="uk-UA"/>
+        </w:rPr>
+        <w:lastRenderedPageBreak/>
+        <w:t>Технічне завдання</w:t>
       </w:r>
       <w:bookmarkEnd w:id="1"/>
     </w:p>
     <w:p>
       <w:pPr>
+        <w:pStyle w:val="2"/>
+        <w:rPr>
+          <w:rFonts w:cs="Times New Roman"/>
+          <w:szCs w:val="28"/>
+          <w:lang w:val="uk-UA" w:eastAsia="ru-RU"/>
+        </w:rPr>
+      </w:pPr>
+      <w:bookmarkStart w:id="2" w:name="_Toc223784832"/>
+      <w:r>
+        <w:rPr>
+          <w:rFonts w:cs="Times New Roman"/>
+          <w:szCs w:val="28"/>
+          <w:lang w:val="uk-UA" w:eastAsia="ru-RU"/>
+        </w:rPr>
+        <w:t>Призначення</w:t>
+      </w:r>
+      <w:bookmarkEnd w:id="2"/>
+    </w:p>
+    <w:p>
+      <w:pPr>
         <w:ind w:firstLine="708"/>
         <w:jc w:val="both"/>
         <w:rPr>
@@ -1265,7 +1339,7 @@
           <w:lang w:val="uk-UA" w:eastAsia="ru-RU"/>
         </w:rPr>
       </w:pPr>
-      <w:bookmarkStart w:id="2" w:name="_Toc223211670"/>
+      <w:bookmarkStart w:id="3" w:name="_Toc223784833"/>
       <w:r>
         <w:rPr>
           <w:rFonts w:cs="Times New Roman"/>
@@ -1274,7 +1348,7 @@
         </w:rPr>
         <w:t>Вимоги щодо вхідних даних</w:t>
       </w:r>
-      <w:bookmarkEnd w:id="2"/>
+      <w:bookmarkEnd w:id="3"/>
     </w:p>
     <w:p>
       <w:pPr>
@@ -1988,7 +2062,7 @@
           <w:lang w:val="uk-UA" w:eastAsia="ru-RU"/>
         </w:rPr>
       </w:pPr>
-      <w:bookmarkStart w:id="3" w:name="_Toc223211671"/>
+      <w:bookmarkStart w:id="4" w:name="_Toc223784834"/>
       <w:r>
         <w:rPr>
           <w:rFonts w:cs="Times New Roman"/>
@@ -1997,7 +2071,7 @@
         </w:rPr>
         <w:t>Вимоги щодо функціоналу програми</w:t>
       </w:r>
-      <w:bookmarkEnd w:id="3"/>
+      <w:bookmarkEnd w:id="4"/>
     </w:p>
     <w:p>
       <w:pPr>
@@ -2384,7 +2458,7 @@
           <w:lang w:val="uk-UA"/>
         </w:rPr>
       </w:pPr>
-      <w:bookmarkStart w:id="4" w:name="_Toc223211672"/>
+      <w:bookmarkStart w:id="5" w:name="_Toc223784835"/>
       <w:r>
         <w:rPr>
           <w:lang w:val="uk-UA"/>
@@ -2392,7 +2466,7 @@
         <w:lastRenderedPageBreak/>
         <w:t>Методологія вирішення задачі</w:t>
       </w:r>
-      <w:bookmarkEnd w:id="4"/>
+      <w:bookmarkEnd w:id="5"/>
     </w:p>
     <w:p>
       <w:pPr>
@@ -2401,14 +2475,152 @@
           <w:lang w:val="uk-UA"/>
         </w:rPr>
       </w:pPr>
-      <w:bookmarkStart w:id="5" w:name="_Toc223211673"/>
+      <w:bookmarkStart w:id="6" w:name="_Toc223784836"/>
       <w:r>
         <w:rPr>
           <w:lang w:val="uk-UA"/>
         </w:rPr>
+        <w:t>Методологія розробки програмного забезпечення</w:t>
+      </w:r>
+      <w:bookmarkEnd w:id="6"/>
+    </w:p>
+    <w:p>
+      <w:pPr>
+        <w:ind w:firstLine="708"/>
+        <w:rPr>
+          <w:lang w:val="uk-UA" w:eastAsia="ru-RU"/>
+        </w:rPr>
+      </w:pPr>
+      <w:r>
+        <w:rPr>
+          <w:lang w:val="uk-UA" w:eastAsia="ru-RU"/>
+        </w:rPr>
+        <w:t xml:space="preserve">Оскільки реалізація програми складається з кількох незалежних модулів (графічний інтерфейс, математичне ядро та візуалізація), які згодом будуть об'єднані для спільної роботи, вибір методології схиляється до найбільш </w:t>
+      </w:r>
+      <w:r>
+        <w:rPr>
+          <w:lang w:val="uk-UA" w:eastAsia="ru-RU"/>
+        </w:rPr>
+        <w:t xml:space="preserve">логічного та гнучкого варіанту – </w:t>
+      </w:r>
+      <w:proofErr w:type="spellStart"/>
+      <w:r>
+        <w:rPr>
+          <w:lang w:val="uk-UA" w:eastAsia="ru-RU"/>
+        </w:rPr>
+        <w:t>і</w:t>
+      </w:r>
+      <w:r>
+        <w:rPr>
+          <w:lang w:val="uk-UA" w:eastAsia="ru-RU"/>
+        </w:rPr>
+        <w:t>теративно-інкрементного</w:t>
+      </w:r>
+      <w:proofErr w:type="spellEnd"/>
+      <w:r>
+        <w:rPr>
+          <w:lang w:val="uk-UA" w:eastAsia="ru-RU"/>
+        </w:rPr>
+        <w:t xml:space="preserve"> методу розробки.</w:t>
+      </w:r>
+    </w:p>
+    <w:p>
+      <w:pPr>
+        <w:ind w:firstLine="708"/>
+        <w:rPr>
+          <w:lang w:val="uk-UA" w:eastAsia="ru-RU"/>
+        </w:rPr>
+      </w:pPr>
+      <w:r>
+        <w:rPr>
+          <w:lang w:val="uk-UA" w:eastAsia="ru-RU"/>
+        </w:rPr>
+        <w:t xml:space="preserve">Функціонал буде розроблятися та публікуватися у </w:t>
+      </w:r>
+      <w:proofErr w:type="spellStart"/>
+      <w:r>
+        <w:rPr>
+          <w:lang w:val="uk-UA" w:eastAsia="ru-RU"/>
+        </w:rPr>
+        <w:t>репозиторії</w:t>
+      </w:r>
+      <w:proofErr w:type="spellEnd"/>
+      <w:r>
+        <w:rPr>
+          <w:lang w:val="uk-UA" w:eastAsia="ru-RU"/>
+        </w:rPr>
+        <w:t xml:space="preserve"> </w:t>
+      </w:r>
+      <w:proofErr w:type="spellStart"/>
+      <w:r>
+        <w:rPr>
+          <w:lang w:val="uk-UA" w:eastAsia="ru-RU"/>
+        </w:rPr>
+        <w:t>GitHub</w:t>
+      </w:r>
+      <w:proofErr w:type="spellEnd"/>
+      <w:r>
+        <w:rPr>
+          <w:lang w:val="uk-UA" w:eastAsia="ru-RU"/>
+        </w:rPr>
+        <w:t xml:space="preserve"> поступово, окремими частинами. Кожен наступний </w:t>
+      </w:r>
+      <w:proofErr w:type="spellStart"/>
+      <w:r>
+        <w:rPr>
+          <w:lang w:val="uk-UA" w:eastAsia="ru-RU"/>
+        </w:rPr>
+        <w:t>комміт</w:t>
+      </w:r>
+      <w:proofErr w:type="spellEnd"/>
+      <w:r>
+        <w:rPr>
+          <w:lang w:val="uk-UA" w:eastAsia="ru-RU"/>
+        </w:rPr>
+        <w:t xml:space="preserve"> міститиме стабільно працюючу частину певного модуля, і так триватиме до повного збирання програми. Наприкінці буде проведено фінальне доопрацювання всіх модулів, тестування та виправлення недоліків, які могли бути упущені на етапах розробки. Після цього етапу розробку програми можна вважати успішно завершеною.</w:t>
+      </w:r>
+    </w:p>
+    <w:p>
+      <w:pPr>
+        <w:ind w:firstLine="708"/>
+        <w:rPr>
+          <w:lang w:val="uk-UA" w:eastAsia="ru-RU"/>
+        </w:rPr>
+      </w:pPr>
+      <w:r>
+        <w:rPr>
+          <w:lang w:val="uk-UA" w:eastAsia="ru-RU"/>
+        </w:rPr>
+        <w:t>Порядок розробки модулів може варіюватися залежно від складності, проте найефективнішим алгоритмом для даної задачі є такий: спочатку створюється математична логіка (обчислення координат), далі розробляється макет та дизайн вікна програми, після чого реалізується зчитування введених да</w:t>
+      </w:r>
+      <w:r>
+        <w:rPr>
+          <w:lang w:val="uk-UA" w:eastAsia="ru-RU"/>
+        </w:rPr>
+        <w:t>них з інтерфейсу, і наостанок – і</w:t>
+      </w:r>
+      <w:r>
+        <w:rPr>
+          <w:lang w:val="uk-UA" w:eastAsia="ru-RU"/>
+        </w:rPr>
+        <w:t>мплементація виведення оброблених даних на інтерактивний графік.</w:t>
+      </w:r>
+    </w:p>
+    <w:p>
+      <w:pPr>
+        <w:pStyle w:val="2"/>
+        <w:rPr>
+          <w:lang w:val="uk-UA"/>
+        </w:rPr>
+      </w:pPr>
+      <w:bookmarkStart w:id="7" w:name="_Toc223784837"/>
+      <w:r>
+        <w:rPr>
+          <w:lang w:val="uk-UA"/>
+        </w:rPr>
         <w:t>Фізична/математична модель руху</w:t>
       </w:r>
-      <w:bookmarkEnd w:id="5"/>
+      <w:bookmarkEnd w:id="7"/>
     </w:p>
     <w:p>
       <w:pPr>
@@ -2795,6 +3007,7 @@
           <w:rFonts w:eastAsiaTheme="minorEastAsia"/>
           <w:lang w:val="uk-UA" w:eastAsia="ru-RU"/>
         </w:rPr>
+        <w:lastRenderedPageBreak/>
         <w:tab/>
         <w:t>І самі рівняння руху в «координатній формі» записуються так:</w:t>
       </w:r>
@@ -3271,7 +3484,7 @@
           <w:lang w:val="uk-UA"/>
         </w:rPr>
       </w:pPr>
-      <w:bookmarkStart w:id="6" w:name="_Toc223211674"/>
+      <w:bookmarkStart w:id="8" w:name="_Toc223784838"/>
       <w:r>
         <w:rPr>
           <w:rFonts w:eastAsiaTheme="minorEastAsia"/>
@@ -3279,7 +3492,7 @@
         </w:rPr>
         <w:t>Програмна реалізація алгоритму</w:t>
       </w:r>
-      <w:bookmarkEnd w:id="6"/>
+      <w:bookmarkEnd w:id="8"/>
     </w:p>
     <w:p>
       <w:pPr>
@@ -3703,7 +3916,239 @@
         <w:jc w:val="both"/>
         <w:rPr>
           <w:rFonts w:eastAsiaTheme="minorEastAsia"/>
+          <w:lang w:val="uk-UA" w:eastAsia="ru-RU"/>
+        </w:rPr>
+      </w:pPr>
+      <w:r>
+        <w:rPr>
+          <w:rFonts w:eastAsiaTheme="minorEastAsia"/>
           <w:lang w:val="en-US" w:eastAsia="ru-RU"/>
+        </w:rPr>
+        <w:t>Done! You’re amazing!</w:t>
+      </w:r>
+    </w:p>
+    <w:p>
+      <w:pPr>
+        <w:pStyle w:val="2"/>
+        <w:rPr>
+          <w:rFonts w:eastAsiaTheme="minorEastAsia"/>
+          <w:lang w:val="uk-UA" w:eastAsia="ru-RU"/>
+        </w:rPr>
+      </w:pPr>
+      <w:bookmarkStart w:id="9" w:name="_Toc223784839"/>
+      <w:r>
+        <w:rPr>
+          <w:rFonts w:eastAsiaTheme="minorEastAsia"/>
+          <w:lang w:val="uk-UA" w:eastAsia="ru-RU"/>
+        </w:rPr>
+        <w:t>Візуалізація та анімація графіків</w:t>
+      </w:r>
+      <w:bookmarkEnd w:id="9"/>
+    </w:p>
+    <w:p>
+      <w:pPr>
+        <w:ind w:firstLine="709"/>
+        <w:jc w:val="both"/>
+        <w:rPr>
+          <w:rFonts w:eastAsiaTheme="minorEastAsia"/>
+          <w:lang w:val="uk-UA" w:eastAsia="ru-RU"/>
+        </w:rPr>
+      </w:pPr>
+      <w:r>
+        <w:rPr>
+          <w:rFonts w:eastAsiaTheme="minorEastAsia"/>
+          <w:lang w:val="uk-UA" w:eastAsia="ru-RU"/>
+        </w:rPr>
+        <w:t xml:space="preserve">Згідно з вимогами методичних вказівок, система має поєднувати підходи векторної та растрової графіки. У </w:t>
+      </w:r>
+      <w:r>
+        <w:rPr>
+          <w:rFonts w:eastAsiaTheme="minorEastAsia"/>
+          <w:lang w:val="uk-UA" w:eastAsia="ru-RU"/>
+        </w:rPr>
+        <w:t>моєму</w:t>
+      </w:r>
+      <w:r>
+        <w:rPr>
+          <w:rFonts w:eastAsiaTheme="minorEastAsia"/>
+          <w:lang w:val="uk-UA" w:eastAsia="ru-RU"/>
+        </w:rPr>
+        <w:t xml:space="preserve"> середовищі це реалізуєть</w:t>
+      </w:r>
+      <w:r>
+        <w:rPr>
+          <w:rFonts w:eastAsiaTheme="minorEastAsia"/>
+          <w:lang w:val="uk-UA" w:eastAsia="ru-RU"/>
+        </w:rPr>
+        <w:t>ся з фокусом на продуктивність:</w:t>
+      </w:r>
+    </w:p>
+    <w:p>
+      <w:pPr>
+        <w:pStyle w:val="ab"/>
+        <w:numPr>
+          <w:ilvl w:val="0"/>
+          <w:numId w:val="2"/>
+        </w:numPr>
+        <w:jc w:val="both"/>
+        <w:rPr>
+          <w:rFonts w:eastAsiaTheme="minorEastAsia"/>
+          <w:lang w:val="uk-UA" w:eastAsia="ru-RU"/>
+        </w:rPr>
+      </w:pPr>
+      <w:r>
+        <w:rPr>
+          <w:rFonts w:eastAsiaTheme="minorEastAsia"/>
+          <w:b/>
+          <w:i/>
+          <w:lang w:val="uk-UA" w:eastAsia="ru-RU"/>
+        </w:rPr>
+        <w:t>Векторна основа:</w:t>
+      </w:r>
+      <w:r>
+        <w:rPr>
+          <w:rFonts w:eastAsiaTheme="minorEastAsia"/>
+          <w:lang w:val="uk-UA" w:eastAsia="ru-RU"/>
+        </w:rPr>
+        <w:t xml:space="preserve"> о</w:t>
+      </w:r>
+      <w:r>
+        <w:rPr>
+          <w:rFonts w:eastAsiaTheme="minorEastAsia"/>
+          <w:lang w:val="uk-UA" w:eastAsia="ru-RU"/>
+        </w:rPr>
+        <w:t>сі, сітка та сама лінія траєкторії формуються</w:t>
+      </w:r>
+      <w:r>
+        <w:rPr>
+          <w:rFonts w:eastAsiaTheme="minorEastAsia"/>
+          <w:lang w:val="uk-UA" w:eastAsia="ru-RU"/>
+        </w:rPr>
+        <w:t xml:space="preserve"> бібліотекою </w:t>
+      </w:r>
+      <w:proofErr w:type="spellStart"/>
+      <w:r>
+        <w:rPr>
+          <w:rFonts w:eastAsiaTheme="minorEastAsia"/>
+          <w:lang w:val="en-US" w:eastAsia="ru-RU"/>
+        </w:rPr>
+        <w:t>m</w:t>
+      </w:r>
+      <w:r>
+        <w:rPr>
+          <w:rFonts w:eastAsiaTheme="minorEastAsia"/>
+          <w:lang w:val="en-US" w:eastAsia="ru-RU"/>
+        </w:rPr>
+        <w:t>atplotlib</w:t>
+      </w:r>
+      <w:proofErr w:type="spellEnd"/>
+      <w:r>
+        <w:rPr>
+          <w:rFonts w:eastAsiaTheme="minorEastAsia"/>
+          <w:lang w:val="uk-UA" w:eastAsia="ru-RU"/>
+        </w:rPr>
+        <w:t xml:space="preserve"> у векторному вигляді</w:t>
+      </w:r>
+      <w:r>
+        <w:rPr>
+          <w:rFonts w:eastAsiaTheme="minorEastAsia"/>
+          <w:lang w:val="uk-UA" w:eastAsia="ru-RU"/>
+        </w:rPr>
+        <w:t xml:space="preserve"> за замовчуванням</w:t>
+      </w:r>
+    </w:p>
+    <w:p>
+      <w:pPr>
+        <w:pStyle w:val="ab"/>
+        <w:numPr>
+          <w:ilvl w:val="0"/>
+          <w:numId w:val="2"/>
+        </w:numPr>
+        <w:jc w:val="both"/>
+        <w:rPr>
+          <w:rFonts w:eastAsiaTheme="minorEastAsia"/>
+          <w:lang w:val="uk-UA" w:eastAsia="ru-RU"/>
+        </w:rPr>
+      </w:pPr>
+      <w:r>
+        <w:rPr>
+          <w:rFonts w:eastAsiaTheme="minorEastAsia"/>
+          <w:b/>
+          <w:i/>
+          <w:lang w:val="uk-UA" w:eastAsia="ru-RU"/>
+        </w:rPr>
+        <w:t xml:space="preserve">Растрове виведення та синхронізація (FPS): </w:t>
+      </w:r>
+      <w:r>
+        <w:rPr>
+          <w:rFonts w:eastAsiaTheme="minorEastAsia"/>
+          <w:lang w:val="uk-UA" w:eastAsia="ru-RU"/>
+        </w:rPr>
+        <w:t>г</w:t>
+      </w:r>
+      <w:r>
+        <w:rPr>
+          <w:rFonts w:eastAsiaTheme="minorEastAsia"/>
+          <w:lang w:val="uk-UA" w:eastAsia="ru-RU"/>
+        </w:rPr>
+        <w:t>рафік вбудовується у вікно програми як растрове зображення. Для забезпечення п</w:t>
+      </w:r>
+      <w:r>
+        <w:rPr>
+          <w:rFonts w:eastAsiaTheme="minorEastAsia"/>
+          <w:lang w:val="uk-UA" w:eastAsia="ru-RU"/>
+        </w:rPr>
+        <w:t xml:space="preserve">лавної «анімації» руху </w:t>
+      </w:r>
+      <w:r>
+        <w:rPr>
+          <w:rFonts w:eastAsiaTheme="minorEastAsia"/>
+          <w:lang w:val="uk-UA" w:eastAsia="ru-RU"/>
+        </w:rPr>
+        <w:t>використовується вбудов</w:t>
+      </w:r>
+      <w:r>
+        <w:rPr>
+          <w:rFonts w:eastAsiaTheme="minorEastAsia"/>
+          <w:lang w:val="uk-UA" w:eastAsia="ru-RU"/>
+        </w:rPr>
+        <w:t>аний таймер інтерфейсу (</w:t>
+      </w:r>
+      <w:proofErr w:type="spellStart"/>
+      <w:r>
+        <w:rPr>
+          <w:rFonts w:eastAsiaTheme="minorEastAsia"/>
+          <w:lang w:val="uk-UA" w:eastAsia="ru-RU"/>
+        </w:rPr>
+        <w:t>QTimer</w:t>
+      </w:r>
+      <w:proofErr w:type="spellEnd"/>
+      <w:r>
+        <w:rPr>
+          <w:rFonts w:eastAsiaTheme="minorEastAsia"/>
+          <w:lang w:val="uk-UA" w:eastAsia="ru-RU"/>
+        </w:rPr>
+        <w:t>)</w:t>
+      </w:r>
+      <w:r>
+        <w:rPr>
+          <w:rFonts w:eastAsiaTheme="minorEastAsia"/>
+          <w:lang w:val="uk-UA" w:eastAsia="ru-RU"/>
+        </w:rPr>
+        <w:t xml:space="preserve"> </w:t>
+      </w:r>
+    </w:p>
+    <w:p>
+      <w:pPr>
+        <w:pStyle w:val="ab"/>
+        <w:numPr>
+          <w:ilvl w:val="0"/>
+          <w:numId w:val="2"/>
+        </w:numPr>
+        <w:jc w:val="both"/>
+        <w:rPr>
+          <w:rFonts w:eastAsiaTheme="minorEastAsia"/>
+          <w:lang w:val="uk-UA" w:eastAsia="ru-RU"/>
         </w:rPr>
         <w:sectPr>
           <w:pgSz w:w="11906" w:h="16838"/>
@@ -3715,81 +4160,18 @@
       <w:r>
         <w:rPr>
           <w:rFonts w:eastAsiaTheme="minorEastAsia"/>
-          <w:lang w:val="en-US" w:eastAsia="ru-RU"/>
-        </w:rPr>
-        <w:t>Done! You’re amazing!</w:t>
-      </w:r>
-    </w:p>
-    <w:p>
-      <w:pPr>
-        <w:pStyle w:val="2"/>
+          <w:lang w:val="uk-UA" w:eastAsia="ru-RU"/>
+        </w:rPr>
+        <w:lastRenderedPageBreak/>
+        <w:t xml:space="preserve">Для уникнення лагів у інтерфейсі </w:t>
+      </w:r>
+      <w:r>
         <w:rPr>
           <w:rFonts w:eastAsiaTheme="minorEastAsia"/>
           <w:lang w:val="uk-UA" w:eastAsia="ru-RU"/>
         </w:rPr>
-      </w:pPr>
-      <w:bookmarkStart w:id="7" w:name="_Toc223211675"/>
-      <w:r>
-        <w:rPr>
-          <w:rFonts w:eastAsiaTheme="minorEastAsia"/>
-          <w:lang w:val="uk-UA" w:eastAsia="ru-RU"/>
-        </w:rPr>
-        <w:lastRenderedPageBreak/>
-        <w:t>Візуалізація та анімація графіків</w:t>
-      </w:r>
-      <w:bookmarkEnd w:id="7"/>
-    </w:p>
-    <w:p>
-      <w:pPr>
-        <w:ind w:firstLine="709"/>
-        <w:jc w:val="both"/>
-        <w:rPr>
-          <w:rFonts w:eastAsiaTheme="minorEastAsia"/>
-          <w:lang w:val="uk-UA" w:eastAsia="ru-RU"/>
-        </w:rPr>
-      </w:pPr>
-      <w:r>
-        <w:rPr>
-          <w:rFonts w:eastAsiaTheme="minorEastAsia"/>
-          <w:lang w:val="uk-UA" w:eastAsia="ru-RU"/>
-        </w:rPr>
-        <w:t xml:space="preserve">Згідно з вимогами методичних вказівок, система має поєднувати підходи векторної та растрової графіки. У </w:t>
-      </w:r>
-      <w:r>
-        <w:rPr>
-          <w:rFonts w:eastAsiaTheme="minorEastAsia"/>
-          <w:lang w:val="uk-UA" w:eastAsia="ru-RU"/>
-        </w:rPr>
-        <w:t>моєму</w:t>
-      </w:r>
-      <w:r>
-        <w:rPr>
-          <w:rFonts w:eastAsiaTheme="minorEastAsia"/>
-          <w:lang w:val="uk-UA" w:eastAsia="ru-RU"/>
-        </w:rPr>
-        <w:t xml:space="preserve"> середовищі це реалізуєть</w:t>
-      </w:r>
-      <w:r>
-        <w:rPr>
-          <w:rFonts w:eastAsiaTheme="minorEastAsia"/>
-          <w:lang w:val="uk-UA" w:eastAsia="ru-RU"/>
-        </w:rPr>
-        <w:t>ся з фокусом на продуктивність:</w:t>
-      </w:r>
-    </w:p>
-    <w:p>
-      <w:pPr>
-        <w:pStyle w:val="ab"/>
-        <w:numPr>
-          <w:ilvl w:val="0"/>
-          <w:numId w:val="2"/>
-        </w:numPr>
-        <w:jc w:val="both"/>
-        <w:rPr>
-          <w:rFonts w:eastAsiaTheme="minorEastAsia"/>
-          <w:lang w:val="uk-UA" w:eastAsia="ru-RU"/>
-        </w:rPr>
-      </w:pPr>
+        <w:t xml:space="preserve">від малювання кожної тисячної частки секунди, </w:t>
+      </w:r>
       <w:r>
         <w:rPr>
           <w:rFonts w:eastAsiaTheme="minorEastAsia"/>
@@ -3797,152 +4179,131 @@
           <w:i/>
           <w:lang w:val="uk-UA" w:eastAsia="ru-RU"/>
         </w:rPr>
-        <w:t>Векторна основа:</w:t>
+        <w:t>графік оновлюється з прив'язкою до частоти кадрів (FPS)</w:t>
       </w:r>
       <w:r>
         <w:rPr>
           <w:rFonts w:eastAsiaTheme="minorEastAsia"/>
           <w:lang w:val="uk-UA" w:eastAsia="ru-RU"/>
         </w:rPr>
-        <w:t xml:space="preserve"> о</w:t>
+        <w:t>. Наприклад, для анімації тривалістю 2 секунди при 30 FPS програма генерує 60 кадрів. Величезний масив заздалегідь обчислених точок ділиться на ці 60</w:t>
       </w:r>
       <w:r>
         <w:rPr>
           <w:rFonts w:eastAsiaTheme="minorEastAsia"/>
           <w:lang w:val="uk-UA" w:eastAsia="ru-RU"/>
         </w:rPr>
-        <w:t>сі, сітка та сама лінія траєкторії формуються</w:t>
+        <w:t xml:space="preserve"> кадрів</w:t>
       </w:r>
       <w:r>
         <w:rPr>
           <w:rFonts w:eastAsiaTheme="minorEastAsia"/>
           <w:lang w:val="uk-UA" w:eastAsia="ru-RU"/>
         </w:rPr>
-        <w:t xml:space="preserve"> бібліотекою </w:t>
+        <w:t xml:space="preserve">. Таймер спрацьовує </w:t>
+      </w:r>
+      <w:r>
+        <w:rPr>
+          <w:rFonts w:eastAsiaTheme="minorEastAsia"/>
+          <w:lang w:val="uk-UA" w:eastAsia="ru-RU"/>
+        </w:rPr>
+        <w:t xml:space="preserve">приблизно кожні </w:t>
+      </w:r>
+      <w:r>
+        <w:rPr>
+          <w:rFonts w:eastAsiaTheme="minorEastAsia"/>
+          <w:lang w:val="uk-UA" w:eastAsia="ru-RU"/>
+        </w:rPr>
+        <w:t xml:space="preserve">33 </w:t>
       </w:r>
       <w:proofErr w:type="spellStart"/>
+      <w:r>
+        <w:rPr>
+          <w:rFonts w:eastAsiaTheme="minorEastAsia"/>
+          <w:lang w:val="uk-UA" w:eastAsia="ru-RU"/>
+        </w:rPr>
+        <w:t>мілісекунди</w:t>
+      </w:r>
+      <w:proofErr w:type="spellEnd"/>
       <w:r>
         <w:rPr>
           <w:rFonts w:eastAsiaTheme="minorEastAsia"/>
           <w:lang w:val="en-US" w:eastAsia="ru-RU"/>
         </w:rPr>
-        <w:t>m</w:t>
+        <w:t xml:space="preserve"> (1000</w:t>
+      </w:r>
+      <w:r>
+        <w:rPr>
+          <w:rFonts w:eastAsiaTheme="minorEastAsia"/>
+          <w:lang w:val="uk-UA" w:eastAsia="ru-RU"/>
+        </w:rPr>
+        <w:t xml:space="preserve">мс </w:t>
       </w:r>
       <w:r>
         <w:rPr>
           <w:rFonts w:eastAsiaTheme="minorEastAsia"/>
           <w:lang w:val="en-US" w:eastAsia="ru-RU"/>
         </w:rPr>
-        <w:t>atplotlib</w:t>
-      </w:r>
-      <w:proofErr w:type="spellEnd"/>
+        <w:t>/</w:t>
+      </w:r>
       <w:r>
         <w:rPr>
           <w:rFonts w:eastAsiaTheme="minorEastAsia"/>
           <w:lang w:val="uk-UA" w:eastAsia="ru-RU"/>
         </w:rPr>
-        <w:t xml:space="preserve"> у векторному вигляді</w:t>
+        <w:t xml:space="preserve"> 30 кадрів)</w:t>
       </w:r>
       <w:r>
         <w:rPr>
           <w:rFonts w:eastAsiaTheme="minorEastAsia"/>
           <w:lang w:val="uk-UA" w:eastAsia="ru-RU"/>
         </w:rPr>
-        <w:t xml:space="preserve"> за замовчуванням</w:t>
+        <w:t>, бере наступну порцію точок з масиву і подовжує лінію на е</w:t>
+      </w:r>
+      <w:r>
+        <w:rPr>
+          <w:rFonts w:eastAsiaTheme="minorEastAsia"/>
+          <w:lang w:val="uk-UA" w:eastAsia="ru-RU"/>
+        </w:rPr>
+        <w:t>крані.</w:t>
       </w:r>
     </w:p>
     <w:p>
       <w:pPr>
-        <w:pStyle w:val="ab"/>
-        <w:numPr>
-          <w:ilvl w:val="0"/>
-          <w:numId w:val="2"/>
-        </w:numPr>
-        <w:jc w:val="both"/>
+        <w:pStyle w:val="1"/>
         <w:rPr>
           <w:rFonts w:eastAsiaTheme="minorEastAsia"/>
-          <w:lang w:val="uk-UA" w:eastAsia="ru-RU"/>
-        </w:rPr>
-      </w:pPr>
+        </w:rPr>
+      </w:pPr>
+      <w:bookmarkStart w:id="10" w:name="_Toc223784840"/>
       <w:r>
         <w:rPr>
           <w:rFonts w:eastAsiaTheme="minorEastAsia"/>
-          <w:b/>
-          <w:i/>
-          <w:lang w:val="uk-UA" w:eastAsia="ru-RU"/>
-        </w:rPr>
-        <w:t xml:space="preserve">Растрове виведення та синхронізація (FPS): </w:t>
+          <w:lang w:val="uk-UA"/>
+        </w:rPr>
+        <w:lastRenderedPageBreak/>
+        <w:t>Графічний алгоритм (</w:t>
       </w:r>
       <w:r>
         <w:rPr>
           <w:rFonts w:eastAsiaTheme="minorEastAsia"/>
-          <w:lang w:val="uk-UA" w:eastAsia="ru-RU"/>
-        </w:rPr>
-        <w:t>г</w:t>
+          <w:lang w:val="uk-UA"/>
+        </w:rPr>
+        <w:t>блок схеми</w:t>
       </w:r>
       <w:r>
         <w:rPr>
           <w:rFonts w:eastAsiaTheme="minorEastAsia"/>
-          <w:lang w:val="uk-UA" w:eastAsia="ru-RU"/>
-        </w:rPr>
-        <w:t>рафік вбудовується у вікно програми як растрове зображення. Для забезпечення п</w:t>
-      </w:r>
-      <w:r>
-        <w:rPr>
-          <w:rFonts w:eastAsiaTheme="minorEastAsia"/>
-          <w:lang w:val="uk-UA" w:eastAsia="ru-RU"/>
-        </w:rPr>
-        <w:t xml:space="preserve">лавної «анімації» руху </w:t>
-      </w:r>
-      <w:r>
-        <w:rPr>
-          <w:rFonts w:eastAsiaTheme="minorEastAsia"/>
-          <w:lang w:val="uk-UA" w:eastAsia="ru-RU"/>
-        </w:rPr>
-        <w:t>використовується вбудов</w:t>
-      </w:r>
-      <w:r>
-        <w:rPr>
-          <w:rFonts w:eastAsiaTheme="minorEastAsia"/>
-          <w:lang w:val="uk-UA" w:eastAsia="ru-RU"/>
-        </w:rPr>
-        <w:t>аний таймер інтерфейсу (</w:t>
-      </w:r>
-      <w:proofErr w:type="spellStart"/>
-      <w:r>
-        <w:rPr>
-          <w:rFonts w:eastAsiaTheme="minorEastAsia"/>
-          <w:lang w:val="uk-UA" w:eastAsia="ru-RU"/>
-        </w:rPr>
-        <w:t>QTimer</w:t>
-      </w:r>
-      <w:proofErr w:type="spellEnd"/>
-      <w:r>
-        <w:rPr>
-          <w:rFonts w:eastAsiaTheme="minorEastAsia"/>
-          <w:lang w:val="uk-UA" w:eastAsia="ru-RU"/>
+          <w:lang w:val="uk-UA"/>
         </w:rPr>
         <w:t>)</w:t>
       </w:r>
-      <w:r>
-        <w:rPr>
-          <w:rFonts w:eastAsiaTheme="minorEastAsia"/>
-          <w:lang w:val="uk-UA" w:eastAsia="ru-RU"/>
-        </w:rPr>
-        <w:t xml:space="preserve"> </w:t>
-      </w:r>
+      <w:bookmarkEnd w:id="10"/>
     </w:p>
     <w:p>
       <w:pPr>
-        <w:pStyle w:val="ab"/>
-        <w:numPr>
-          <w:ilvl w:val="0"/>
-          <w:numId w:val="2"/>
-        </w:numPr>
-        <w:jc w:val="both"/>
-        <w:rPr>
-          <w:rFonts w:eastAsiaTheme="minorEastAsia"/>
-          <w:lang w:val="uk-UA" w:eastAsia="ru-RU"/>
+        <w:rPr>
+          <w:lang w:eastAsia="ru-RU"/>
         </w:rPr>
         <w:sectPr>
           <w:pgSz w:w="11906" w:h="16838"/>
@@ -3953,167 +4314,13 @@
       </w:pPr>
       <w:r>
         <w:rPr>
-          <w:rFonts w:eastAsiaTheme="minorEastAsia"/>
-          <w:lang w:val="uk-UA" w:eastAsia="ru-RU"/>
-        </w:rPr>
-        <w:t xml:space="preserve">Для уникнення лагів у інтерфейсі </w:t>
-      </w:r>
-      <w:r>
-        <w:rPr>
-          <w:rFonts w:eastAsiaTheme="minorEastAsia"/>
-          <w:lang w:val="uk-UA" w:eastAsia="ru-RU"/>
-        </w:rPr>
-        <w:t xml:space="preserve">від малювання кожної тисячної частки секунди, </w:t>
-      </w:r>
-      <w:r>
-        <w:rPr>
-          <w:rFonts w:eastAsiaTheme="minorEastAsia"/>
-          <w:b/>
-          <w:i/>
-          <w:lang w:val="uk-UA" w:eastAsia="ru-RU"/>
-        </w:rPr>
-        <w:t>графік оновлюється з прив'язкою до частоти кадрів (FPS)</w:t>
-      </w:r>
-      <w:r>
-        <w:rPr>
-          <w:rFonts w:eastAsiaTheme="minorEastAsia"/>
-          <w:lang w:val="uk-UA" w:eastAsia="ru-RU"/>
-        </w:rPr>
-        <w:t>. Наприклад, для анімації тривалістю 2 секунди при 30 FPS програма генерує 60 кадрів. Величезний масив заздалегідь обчислених точок ділиться на ці 60</w:t>
-      </w:r>
-      <w:r>
-        <w:rPr>
-          <w:rFonts w:eastAsiaTheme="minorEastAsia"/>
-          <w:lang w:val="uk-UA" w:eastAsia="ru-RU"/>
-        </w:rPr>
-        <w:t xml:space="preserve"> кадрів</w:t>
-      </w:r>
-      <w:r>
-        <w:rPr>
-          <w:rFonts w:eastAsiaTheme="minorEastAsia"/>
-          <w:lang w:val="uk-UA" w:eastAsia="ru-RU"/>
-        </w:rPr>
-        <w:t xml:space="preserve">. Таймер спрацьовує </w:t>
-      </w:r>
-      <w:r>
-        <w:rPr>
-          <w:rFonts w:eastAsiaTheme="minorEastAsia"/>
-          <w:lang w:val="uk-UA" w:eastAsia="ru-RU"/>
-        </w:rPr>
-        <w:t xml:space="preserve">приблизно кожні </w:t>
-      </w:r>
-      <w:r>
-        <w:rPr>
-          <w:rFonts w:eastAsiaTheme="minorEastAsia"/>
-          <w:lang w:val="uk-UA" w:eastAsia="ru-RU"/>
-        </w:rPr>
-        <w:t xml:space="preserve">33 </w:t>
-      </w:r>
-      <w:proofErr w:type="spellStart"/>
-      <w:r>
-        <w:rPr>
-          <w:rFonts w:eastAsiaTheme="minorEastAsia"/>
-          <w:lang w:val="uk-UA" w:eastAsia="ru-RU"/>
-        </w:rPr>
-        <w:t>мілісекунди</w:t>
-      </w:r>
-      <w:proofErr w:type="spellEnd"/>
-      <w:r>
-        <w:rPr>
-          <w:rFonts w:eastAsiaTheme="minorEastAsia"/>
-          <w:lang w:val="en-US" w:eastAsia="ru-RU"/>
-        </w:rPr>
-        <w:t xml:space="preserve"> (1000</w:t>
-      </w:r>
-      <w:r>
-        <w:rPr>
-          <w:rFonts w:eastAsiaTheme="minorEastAsia"/>
-          <w:lang w:val="uk-UA" w:eastAsia="ru-RU"/>
-        </w:rPr>
-        <w:t xml:space="preserve">мс </w:t>
-      </w:r>
-      <w:r>
-        <w:rPr>
-          <w:rFonts w:eastAsiaTheme="minorEastAsia"/>
-          <w:lang w:val="en-US" w:eastAsia="ru-RU"/>
-        </w:rPr>
-        <w:t>/</w:t>
-      </w:r>
-      <w:r>
-        <w:rPr>
-          <w:rFonts w:eastAsiaTheme="minorEastAsia"/>
-          <w:lang w:val="uk-UA" w:eastAsia="ru-RU"/>
-        </w:rPr>
-        <w:t xml:space="preserve"> 30 кадрів)</w:t>
-      </w:r>
-      <w:r>
-        <w:rPr>
-          <w:rFonts w:eastAsiaTheme="minorEastAsia"/>
-          <w:lang w:val="uk-UA" w:eastAsia="ru-RU"/>
-        </w:rPr>
-        <w:t>, бере наступну порцію точок з масиву і подовжує лінію на е</w:t>
-      </w:r>
-      <w:r>
-        <w:rPr>
-          <w:rFonts w:eastAsiaTheme="minorEastAsia"/>
-          <w:lang w:val="uk-UA" w:eastAsia="ru-RU"/>
-        </w:rPr>
-        <w:t>крані.</w:t>
-      </w:r>
-    </w:p>
-    <w:p>
-      <w:pPr>
-        <w:pStyle w:val="1"/>
-        <w:rPr>
-          <w:rFonts w:eastAsiaTheme="minorEastAsia"/>
-        </w:rPr>
-      </w:pPr>
-      <w:bookmarkStart w:id="8" w:name="_Toc223211676"/>
-      <w:r>
-        <w:rPr>
-          <w:rFonts w:eastAsiaTheme="minorEastAsia"/>
-          <w:lang w:val="uk-UA"/>
-        </w:rPr>
-        <w:lastRenderedPageBreak/>
-        <w:t>Графічний алгоритм (</w:t>
-      </w:r>
-      <w:r>
-        <w:rPr>
-          <w:rFonts w:eastAsiaTheme="minorEastAsia"/>
-          <w:lang w:val="uk-UA"/>
-        </w:rPr>
-        <w:t>блок схеми</w:t>
-      </w:r>
-      <w:r>
-        <w:rPr>
-          <w:rFonts w:eastAsiaTheme="minorEastAsia"/>
-          <w:lang w:val="uk-UA"/>
-        </w:rPr>
-        <w:t>)</w:t>
-      </w:r>
-      <w:bookmarkEnd w:id="8"/>
-    </w:p>
-    <w:p>
-      <w:pPr>
-        <w:rPr>
-          <w:lang w:eastAsia="ru-RU"/>
-        </w:rPr>
-        <w:sectPr>
-          <w:pgSz w:w="11906" w:h="16838"/>
-          <w:pgMar w:top="1134" w:right="850" w:bottom="1134" w:left="1701" w:header="708" w:footer="708" w:gutter="0"/>
-          <w:cols w:space="708"/>
-          <w:docGrid w:linePitch="360"/>
-        </w:sectPr>
-      </w:pPr>
-      <w:r>
-        <w:rPr>
           <w:noProof/>
           <w:lang w:eastAsia="ru-RU"/>
         </w:rPr>
         <mc:AlternateContent>
           <mc:Choice Requires="wpc">
             <w:drawing>
-              <wp:inline distT="0" distB="0" distL="0" distR="0" wp14:anchorId="05681EC8" wp14:editId="06719A74">
+              <wp:inline distT="0" distB="0" distL="0" distR="0" wp14:anchorId="74538E09" wp14:editId="447CDD7D">
                 <wp:extent cx="5935345" cy="8728512"/>
                 <wp:effectExtent l="0" t="0" r="0" b="0"/>
                 <wp:docPr id="1" name="Полотно 1"/>
@@ -7314,7 +7521,7 @@
           </mc:Choice>
           <mc:Fallback>
             <w:pict>
-              <v:group id="Полотно 1" o:spid="_x0000_s1026" editas="canvas" style="width:467.35pt;height:687.3pt;mso-position-horizontal-relative:char;mso-position-vertical-relative:line" coordsize="59353,87280" o:gfxdata="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">
+              <v:group w14:anchorId="74538E09" id="Полотно 1" o:spid="_x0000_s1026" editas="canvas" style="width:467.35pt;height:687.3pt;mso-position-horizontal-relative:char;mso-position-vertical-relative:line" coordsize="59353,87280" o:gfxdata="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">
                 <v:shapetype id="_x0000_t75" coordsize="21600,21600" o:spt="75" o:preferrelative="t" path="m@4@5l@4@11@9@11@9@5xe" filled="f" stroked="f">
                   <v:stroke joinstyle="miter"/>
                   <v:formulas>
@@ -8600,7 +8807,7 @@
           <w:lang w:val="uk-UA"/>
         </w:rPr>
       </w:pPr>
-      <w:bookmarkStart w:id="9" w:name="_Toc223211677"/>
+      <w:bookmarkStart w:id="11" w:name="_Toc223784841"/>
       <w:r>
         <w:rPr>
           <w:lang w:val="uk-UA"/>
@@ -8608,7 +8815,7 @@
         <w:lastRenderedPageBreak/>
         <w:t>Висновок</w:t>
       </w:r>
-      <w:bookmarkEnd w:id="9"/>
+      <w:bookmarkEnd w:id="11"/>
     </w:p>
     <w:p>
       <w:pPr>
@@ -8706,8 +8913,6 @@
           <w:t>https://github.com/yuriybrych/MPI</w:t>
         </w:r>
       </w:hyperlink>
-      <w:bookmarkStart w:id="10" w:name="_GoBack"/>
-      <w:bookmarkEnd w:id="10"/>
     </w:p>
     <w:sectPr>
       <w:pgSz w:w="11906" w:h="16838"/>
@@ -10069,7 +10274,7 @@
 </file>
 
 <file path=customXml/itemProps1.xml><?xml version="1.0" encoding="utf-8"?>
-<ds:datastoreItem xmlns:ds="http://schemas.openxmlformats.org/officeDocument/2006/customXml" ds:itemID="{35E36BC1-AB59-4D9D-A6A7-302163237ED8}">
+<ds:datastoreItem xmlns:ds="http://schemas.openxmlformats.org/officeDocument/2006/customXml" ds:itemID="{4039F844-99E6-4337-83F9-BBC21C1BE987}">
   <ds:schemaRefs>
     <ds:schemaRef ds:uri="http://schemas.openxmlformats.org/officeDocument/2006/bibliography"/>
   </ds:schemaRefs>

</xml_diff>

<commit_message>
[L1.1 | L1.2] | Small changes / first code
- Small changes to methodology
- Math module created
</commit_message>
<xml_diff>
--- a/L1.1/L1.1.docx
+++ b/L1.1/L1.1.docx
@@ -1243,32 +1243,92 @@
           <w:docGrid w:linePitch="360"/>
         </w:sectPr>
       </w:pPr>
-      <w:bookmarkStart w:id="0" w:name="_GoBack"/>
+    </w:p>
+    <w:p>
+      <w:pPr>
+        <w:pStyle w:val="1"/>
+        <w:rPr>
+          <w:rFonts w:cs="Times New Roman"/>
+          <w:szCs w:val="28"/>
+          <w:lang w:val="uk-UA"/>
+        </w:rPr>
+      </w:pPr>
+      <w:bookmarkStart w:id="0" w:name="_Toc223784831"/>
+      <w:r>
+        <w:rPr>
+          <w:rFonts w:cs="Times New Roman"/>
+          <w:szCs w:val="28"/>
+          <w:lang w:val="uk-UA"/>
+        </w:rPr>
+        <w:lastRenderedPageBreak/>
+        <w:t>Технічне завдання</w:t>
+      </w:r>
       <w:bookmarkEnd w:id="0"/>
     </w:p>
     <w:p>
       <w:pPr>
-        <w:pStyle w:val="1"/>
+        <w:pStyle w:val="2"/>
         <w:rPr>
           <w:rFonts w:cs="Times New Roman"/>
           <w:szCs w:val="28"/>
-          <w:lang w:val="uk-UA"/>
-        </w:rPr>
-      </w:pPr>
-      <w:bookmarkStart w:id="1" w:name="_Toc223784831"/>
+          <w:lang w:val="uk-UA" w:eastAsia="ru-RU"/>
+        </w:rPr>
+      </w:pPr>
+      <w:bookmarkStart w:id="1" w:name="_Toc223784832"/>
       <w:r>
         <w:rPr>
           <w:rFonts w:cs="Times New Roman"/>
           <w:szCs w:val="28"/>
-          <w:lang w:val="uk-UA"/>
-        </w:rPr>
-        <w:lastRenderedPageBreak/>
-        <w:t>Технічне завдання</w:t>
+          <w:lang w:val="uk-UA" w:eastAsia="ru-RU"/>
+        </w:rPr>
+        <w:t>Призначення</w:t>
       </w:r>
       <w:bookmarkEnd w:id="1"/>
     </w:p>
     <w:p>
       <w:pPr>
+        <w:ind w:firstLine="708"/>
+        <w:rPr>
+          <w:rFonts w:cs="Times New Roman"/>
+          <w:szCs w:val="28"/>
+          <w:lang w:val="uk-UA" w:eastAsia="ru-RU"/>
+        </w:rPr>
+      </w:pPr>
+      <w:r>
+        <w:rPr>
+          <w:rFonts w:cs="Times New Roman"/>
+          <w:szCs w:val="28"/>
+          <w:lang w:val="uk-UA" w:eastAsia="ru-RU"/>
+        </w:rPr>
+        <w:t>Це технічне завдання створено для пояснення етапів, які будуть використовувати</w:t>
+      </w:r>
+      <w:r>
+        <w:rPr>
+          <w:rFonts w:cs="Times New Roman"/>
+          <w:szCs w:val="28"/>
+          <w:lang w:val="uk-UA" w:eastAsia="ru-RU"/>
+        </w:rPr>
+        <w:t>ся в подальшому створенні</w:t>
+      </w:r>
+      <w:r>
+        <w:rPr>
+          <w:rFonts w:cs="Times New Roman"/>
+          <w:szCs w:val="28"/>
+          <w:lang w:val="uk-UA" w:eastAsia="ru-RU"/>
+        </w:rPr>
+        <w:t xml:space="preserve"> програми з графічним інтерфейсом, яка призначена для моделювання та візуалізації траєкторії прямолінійного </w:t>
+      </w:r>
+      <w:r>
+        <w:rPr>
+          <w:rFonts w:cs="Times New Roman"/>
+          <w:szCs w:val="28"/>
+          <w:lang w:val="uk-UA" w:eastAsia="ru-RU"/>
+        </w:rPr>
+        <w:t>руху матеріальної точки у просторі</w:t>
+      </w:r>
+    </w:p>
+    <w:p>
+      <w:pPr>
         <w:pStyle w:val="2"/>
         <w:rPr>
           <w:rFonts w:cs="Times New Roman"/>
@@ -1276,83 +1336,19 @@
           <w:lang w:val="uk-UA" w:eastAsia="ru-RU"/>
         </w:rPr>
       </w:pPr>
-      <w:bookmarkStart w:id="2" w:name="_Toc223784832"/>
+      <w:bookmarkStart w:id="2" w:name="_Toc223784833"/>
       <w:r>
         <w:rPr>
           <w:rFonts w:cs="Times New Roman"/>
           <w:szCs w:val="28"/>
           <w:lang w:val="uk-UA" w:eastAsia="ru-RU"/>
         </w:rPr>
-        <w:t>Призначення</w:t>
+        <w:t>Вимоги щодо вхідних даних</w:t>
       </w:r>
       <w:bookmarkEnd w:id="2"/>
     </w:p>
     <w:p>
       <w:pPr>
-        <w:ind w:firstLine="708"/>
-        <w:jc w:val="both"/>
-        <w:rPr>
-          <w:rFonts w:cs="Times New Roman"/>
-          <w:szCs w:val="28"/>
-          <w:lang w:val="uk-UA" w:eastAsia="ru-RU"/>
-        </w:rPr>
-      </w:pPr>
-      <w:r>
-        <w:rPr>
-          <w:rFonts w:cs="Times New Roman"/>
-          <w:szCs w:val="28"/>
-          <w:lang w:val="uk-UA" w:eastAsia="ru-RU"/>
-        </w:rPr>
-        <w:t>Це технічне завдання створено для пояснення етапів, які будуть використовувати</w:t>
-      </w:r>
-      <w:r>
-        <w:rPr>
-          <w:rFonts w:cs="Times New Roman"/>
-          <w:szCs w:val="28"/>
-          <w:lang w:val="uk-UA" w:eastAsia="ru-RU"/>
-        </w:rPr>
-        <w:t>ся в подальшому створенні</w:t>
-      </w:r>
-      <w:r>
-        <w:rPr>
-          <w:rFonts w:cs="Times New Roman"/>
-          <w:szCs w:val="28"/>
-          <w:lang w:val="uk-UA" w:eastAsia="ru-RU"/>
-        </w:rPr>
-        <w:t xml:space="preserve"> програми з графічним інтерфейсом, яка призначена для моделювання та візуалізації траєкторії прямолінійного </w:t>
-      </w:r>
-      <w:r>
-        <w:rPr>
-          <w:rFonts w:cs="Times New Roman"/>
-          <w:szCs w:val="28"/>
-          <w:lang w:val="uk-UA" w:eastAsia="ru-RU"/>
-        </w:rPr>
-        <w:t>руху матеріальної точки у просторі</w:t>
-      </w:r>
-    </w:p>
-    <w:p>
-      <w:pPr>
-        <w:pStyle w:val="2"/>
-        <w:rPr>
-          <w:rFonts w:cs="Times New Roman"/>
-          <w:szCs w:val="28"/>
-          <w:lang w:val="uk-UA" w:eastAsia="ru-RU"/>
-        </w:rPr>
-      </w:pPr>
-      <w:bookmarkStart w:id="3" w:name="_Toc223784833"/>
-      <w:r>
-        <w:rPr>
-          <w:rFonts w:cs="Times New Roman"/>
-          <w:szCs w:val="28"/>
-          <w:lang w:val="uk-UA" w:eastAsia="ru-RU"/>
-        </w:rPr>
-        <w:t>Вимоги щодо вхідних даних</w:t>
-      </w:r>
-      <w:bookmarkEnd w:id="3"/>
-    </w:p>
-    <w:p>
-      <w:pPr>
-        <w:jc w:val="both"/>
         <w:rPr>
           <w:rFonts w:cs="Times New Roman"/>
           <w:szCs w:val="28"/>
@@ -1392,7 +1388,6 @@
           <w:ilvl w:val="0"/>
           <w:numId w:val="2"/>
         </w:numPr>
-        <w:jc w:val="both"/>
         <w:rPr>
           <w:rFonts w:cs="Times New Roman"/>
           <w:szCs w:val="28"/>
@@ -1505,7 +1500,6 @@
           <w:ilvl w:val="0"/>
           <w:numId w:val="2"/>
         </w:numPr>
-        <w:jc w:val="both"/>
         <w:rPr>
           <w:rFonts w:cs="Times New Roman"/>
           <w:szCs w:val="28"/>
@@ -1570,7 +1564,6 @@
           <w:ilvl w:val="0"/>
           <w:numId w:val="2"/>
         </w:numPr>
-        <w:jc w:val="both"/>
         <w:rPr>
           <w:rFonts w:cs="Times New Roman"/>
           <w:szCs w:val="28"/>
@@ -1669,7 +1662,6 @@
           <w:ilvl w:val="0"/>
           <w:numId w:val="2"/>
         </w:numPr>
-        <w:jc w:val="both"/>
         <w:rPr>
           <w:rFonts w:cs="Times New Roman"/>
           <w:szCs w:val="28"/>
@@ -1776,7 +1768,6 @@
           <w:ilvl w:val="0"/>
           <w:numId w:val="2"/>
         </w:numPr>
-        <w:jc w:val="both"/>
         <w:rPr>
           <w:rFonts w:cs="Times New Roman"/>
           <w:szCs w:val="28"/>
@@ -1865,7 +1856,6 @@
           <w:ilvl w:val="0"/>
           <w:numId w:val="2"/>
         </w:numPr>
-        <w:jc w:val="both"/>
         <w:rPr>
           <w:rFonts w:cs="Times New Roman"/>
           <w:szCs w:val="28"/>
@@ -1972,7 +1962,6 @@
           <w:ilvl w:val="0"/>
           <w:numId w:val="2"/>
         </w:numPr>
-        <w:jc w:val="both"/>
         <w:rPr>
           <w:rFonts w:cs="Times New Roman"/>
           <w:szCs w:val="28"/>
@@ -2003,7 +1992,6 @@
           <w:ilvl w:val="0"/>
           <w:numId w:val="2"/>
         </w:numPr>
-        <w:jc w:val="both"/>
         <w:rPr>
           <w:rFonts w:cs="Times New Roman"/>
           <w:szCs w:val="28"/>
@@ -2062,7 +2050,7 @@
           <w:lang w:val="uk-UA" w:eastAsia="ru-RU"/>
         </w:rPr>
       </w:pPr>
-      <w:bookmarkStart w:id="4" w:name="_Toc223784834"/>
+      <w:bookmarkStart w:id="3" w:name="_Toc223784834"/>
       <w:r>
         <w:rPr>
           <w:rFonts w:cs="Times New Roman"/>
@@ -2071,7 +2059,7 @@
         </w:rPr>
         <w:t>Вимоги щодо функціоналу програми</w:t>
       </w:r>
-      <w:bookmarkEnd w:id="4"/>
+      <w:bookmarkEnd w:id="3"/>
     </w:p>
     <w:p>
       <w:pPr>
@@ -2458,31 +2446,71 @@
           <w:lang w:val="uk-UA"/>
         </w:rPr>
       </w:pPr>
-      <w:bookmarkStart w:id="5" w:name="_Toc223784835"/>
+      <w:bookmarkStart w:id="4" w:name="_Toc223784835"/>
       <w:r>
         <w:rPr>
           <w:lang w:val="uk-UA"/>
         </w:rPr>
         <w:lastRenderedPageBreak/>
         <w:t>Методологія вирішення задачі</w:t>
+      </w:r>
+      <w:bookmarkEnd w:id="4"/>
+    </w:p>
+    <w:p>
+      <w:pPr>
+        <w:pStyle w:val="2"/>
+        <w:rPr>
+          <w:lang w:val="uk-UA"/>
+        </w:rPr>
+      </w:pPr>
+      <w:bookmarkStart w:id="5" w:name="_Toc223784836"/>
+      <w:r>
+        <w:rPr>
+          <w:lang w:val="uk-UA"/>
+        </w:rPr>
+        <w:t>Методологія розробки програмного забезпечення</w:t>
       </w:r>
       <w:bookmarkEnd w:id="5"/>
     </w:p>
     <w:p>
       <w:pPr>
-        <w:pStyle w:val="2"/>
-        <w:rPr>
-          <w:lang w:val="uk-UA"/>
-        </w:rPr>
-      </w:pPr>
-      <w:bookmarkStart w:id="6" w:name="_Toc223784836"/>
-      <w:r>
-        <w:rPr>
-          <w:lang w:val="uk-UA"/>
-        </w:rPr>
-        <w:t>Методологія розробки програмного забезпечення</w:t>
-      </w:r>
-      <w:bookmarkEnd w:id="6"/>
+        <w:ind w:firstLine="708"/>
+        <w:rPr>
+          <w:lang w:val="uk-UA" w:eastAsia="ru-RU"/>
+        </w:rPr>
+      </w:pPr>
+      <w:r>
+        <w:rPr>
+          <w:lang w:val="uk-UA" w:eastAsia="ru-RU"/>
+        </w:rPr>
+        <w:t xml:space="preserve">Оскільки реалізація програми складається з кількох незалежних модулів (графічний інтерфейс, математичне ядро та візуалізація), які згодом будуть об'єднані для спільної роботи, вибір методології схиляється до найбільш </w:t>
+      </w:r>
+      <w:r>
+        <w:rPr>
+          <w:lang w:val="uk-UA" w:eastAsia="ru-RU"/>
+        </w:rPr>
+        <w:t xml:space="preserve">логічного та гнучкого варіанту – </w:t>
+      </w:r>
+      <w:proofErr w:type="spellStart"/>
+      <w:r>
+        <w:rPr>
+          <w:lang w:val="uk-UA" w:eastAsia="ru-RU"/>
+        </w:rPr>
+        <w:t>і</w:t>
+      </w:r>
+      <w:r>
+        <w:rPr>
+          <w:lang w:val="uk-UA" w:eastAsia="ru-RU"/>
+        </w:rPr>
+        <w:t>теративно-інкрементного</w:t>
+      </w:r>
+      <w:proofErr w:type="spellEnd"/>
+      <w:r>
+        <w:rPr>
+          <w:lang w:val="uk-UA" w:eastAsia="ru-RU"/>
+        </w:rPr>
+        <w:t xml:space="preserve"> методу розробки.</w:t>
+      </w:r>
     </w:p>
     <w:p>
       <w:pPr>
@@ -2495,89 +2523,57 @@
         <w:rPr>
           <w:lang w:val="uk-UA" w:eastAsia="ru-RU"/>
         </w:rPr>
-        <w:t xml:space="preserve">Оскільки реалізація програми складається з кількох незалежних модулів (графічний інтерфейс, математичне ядро та візуалізація), які згодом будуть об'єднані для спільної роботи, вибір методології схиляється до найбільш </w:t>
-      </w:r>
-      <w:r>
-        <w:rPr>
-          <w:lang w:val="uk-UA" w:eastAsia="ru-RU"/>
-        </w:rPr>
-        <w:t xml:space="preserve">логічного та гнучкого варіанту – </w:t>
+        <w:t xml:space="preserve">Функціонал буде розроблятися та публікуватися у </w:t>
       </w:r>
       <w:proofErr w:type="spellStart"/>
       <w:r>
         <w:rPr>
           <w:lang w:val="uk-UA" w:eastAsia="ru-RU"/>
         </w:rPr>
-        <w:t>і</w:t>
-      </w:r>
-      <w:r>
-        <w:rPr>
-          <w:lang w:val="uk-UA" w:eastAsia="ru-RU"/>
-        </w:rPr>
-        <w:t>теративно-інкрементного</w:t>
+        <w:t>репозиторії</w:t>
       </w:r>
       <w:proofErr w:type="spellEnd"/>
       <w:r>
         <w:rPr>
           <w:lang w:val="uk-UA" w:eastAsia="ru-RU"/>
         </w:rPr>
-        <w:t xml:space="preserve"> методу розробки.</w:t>
-      </w:r>
-    </w:p>
-    <w:p>
-      <w:pPr>
-        <w:ind w:firstLine="708"/>
-        <w:rPr>
-          <w:lang w:val="uk-UA" w:eastAsia="ru-RU"/>
-        </w:rPr>
-      </w:pPr>
-      <w:r>
-        <w:rPr>
-          <w:lang w:val="uk-UA" w:eastAsia="ru-RU"/>
-        </w:rPr>
-        <w:t xml:space="preserve">Функціонал буде розроблятися та публікуватися у </w:t>
+        <w:t xml:space="preserve"> </w:t>
       </w:r>
       <w:proofErr w:type="spellStart"/>
       <w:r>
         <w:rPr>
           <w:lang w:val="uk-UA" w:eastAsia="ru-RU"/>
         </w:rPr>
-        <w:t>репозиторії</w:t>
+        <w:t>GitHub</w:t>
       </w:r>
       <w:proofErr w:type="spellEnd"/>
       <w:r>
         <w:rPr>
           <w:lang w:val="uk-UA" w:eastAsia="ru-RU"/>
         </w:rPr>
-        <w:t xml:space="preserve"> </w:t>
+        <w:t xml:space="preserve"> поступово, окремими частинами. Кожен наступний </w:t>
       </w:r>
       <w:proofErr w:type="spellStart"/>
       <w:r>
         <w:rPr>
           <w:lang w:val="uk-UA" w:eastAsia="ru-RU"/>
         </w:rPr>
-        <w:t>GitHub</w:t>
+        <w:t>комміт</w:t>
       </w:r>
       <w:proofErr w:type="spellEnd"/>
       <w:r>
         <w:rPr>
           <w:lang w:val="uk-UA" w:eastAsia="ru-RU"/>
         </w:rPr>
-        <w:t xml:space="preserve"> поступово, окремими частинами. Кожен наступний </w:t>
-      </w:r>
-      <w:proofErr w:type="spellStart"/>
-      <w:r>
-        <w:rPr>
-          <w:lang w:val="uk-UA" w:eastAsia="ru-RU"/>
-        </w:rPr>
-        <w:t>комміт</w:t>
-      </w:r>
-      <w:proofErr w:type="spellEnd"/>
-      <w:r>
-        <w:rPr>
-          <w:lang w:val="uk-UA" w:eastAsia="ru-RU"/>
-        </w:rPr>
-        <w:t xml:space="preserve"> міститиме стабільно працюючу частину певного модуля, і так триватиме до повного збирання програми. Наприкінці буде проведено фінальне доопрацювання всіх модулів, тестування та виправлення недоліків, які могли бути упущені на етапах розробки. Після цього етапу розробку програми можна вважати успішно завершеною.</w:t>
+        <w:t xml:space="preserve"> міститиме стабільно працюючу частину певного модуля, і так триватиме до повного збирання програми. Наприкінці буде проведено фінальне доопрацювання всіх модулів, тестування т</w:t>
+      </w:r>
+      <w:bookmarkStart w:id="6" w:name="_GoBack"/>
+      <w:bookmarkEnd w:id="6"/>
+      <w:r>
+        <w:rPr>
+          <w:lang w:val="uk-UA" w:eastAsia="ru-RU"/>
+        </w:rPr>
+        <w:t>а виправлення недоліків, які могли бути упущені на етапах розробки. Після цього етапу розробку програми можна вважати успішно завершеною.</w:t>
       </w:r>
     </w:p>
     <w:p>
@@ -2625,7 +2621,6 @@
     <w:p>
       <w:pPr>
         <w:ind w:firstLine="708"/>
-        <w:jc w:val="both"/>
         <w:rPr>
           <w:lang w:val="en-US"/>
         </w:rPr>
@@ -2712,7 +2707,6 @@
     <w:p>
       <w:pPr>
         <w:ind w:firstLine="708"/>
-        <w:jc w:val="both"/>
         <w:rPr>
           <w:rFonts w:eastAsiaTheme="minorEastAsia"/>
           <w:lang w:val="en-US" w:eastAsia="ru-RU"/>
@@ -2894,7 +2888,6 @@
     <w:p>
       <w:pPr>
         <w:ind w:firstLine="708"/>
-        <w:jc w:val="both"/>
         <w:rPr>
           <w:rFonts w:eastAsiaTheme="minorEastAsia"/>
           <w:lang w:val="en-US" w:eastAsia="ru-RU"/>
@@ -2996,7 +2989,6 @@
     </w:p>
     <w:p>
       <w:pPr>
-        <w:jc w:val="both"/>
         <w:rPr>
           <w:rFonts w:eastAsiaTheme="minorEastAsia"/>
           <w:lang w:val="uk-UA" w:eastAsia="ru-RU"/>
@@ -3007,14 +2999,12 @@
           <w:rFonts w:eastAsiaTheme="minorEastAsia"/>
           <w:lang w:val="uk-UA" w:eastAsia="ru-RU"/>
         </w:rPr>
-        <w:lastRenderedPageBreak/>
         <w:tab/>
         <w:t>І самі рівняння руху в «координатній формі» записуються так:</w:t>
       </w:r>
     </w:p>
     <w:p>
       <w:pPr>
-        <w:jc w:val="both"/>
         <w:rPr>
           <w:rFonts w:eastAsiaTheme="minorEastAsia"/>
           <w:i/>
@@ -3028,6 +3018,7 @@
               <w:rFonts w:ascii="Cambria Math" w:eastAsiaTheme="minorEastAsia" w:hAnsi="Cambria Math"/>
               <w:lang w:val="uk-UA" w:eastAsia="ru-RU"/>
             </w:rPr>
+            <w:lastRenderedPageBreak/>
             <m:t>x</m:t>
           </m:r>
           <m:d>
@@ -3221,7 +3212,6 @@
     </w:p>
     <w:p>
       <w:pPr>
-        <w:jc w:val="both"/>
         <w:rPr>
           <w:rFonts w:eastAsiaTheme="minorEastAsia"/>
           <w:i/>
@@ -3429,7 +3419,6 @@
     <w:p>
       <w:pPr>
         <w:ind w:firstLine="708"/>
-        <w:jc w:val="both"/>
         <w:rPr>
           <w:lang w:val="uk-UA"/>
         </w:rPr>
@@ -3497,7 +3486,6 @@
     <w:p>
       <w:pPr>
         <w:ind w:firstLine="709"/>
-        <w:jc w:val="both"/>
         <w:rPr>
           <w:rFonts w:eastAsiaTheme="minorEastAsia"/>
           <w:lang w:val="uk-UA" w:eastAsia="ru-RU"/>
@@ -3553,7 +3541,6 @@
           <w:ilvl w:val="0"/>
           <w:numId w:val="2"/>
         </w:numPr>
-        <w:jc w:val="both"/>
         <w:rPr>
           <w:rFonts w:eastAsiaTheme="minorEastAsia"/>
           <w:lang w:val="uk-UA" w:eastAsia="ru-RU"/>
@@ -3581,7 +3568,6 @@
           <w:ilvl w:val="0"/>
           <w:numId w:val="2"/>
         </w:numPr>
-        <w:jc w:val="both"/>
         <w:rPr>
           <w:rFonts w:eastAsiaTheme="minorEastAsia"/>
           <w:lang w:val="uk-UA" w:eastAsia="ru-RU"/>
@@ -3630,7 +3616,6 @@
           <w:ilvl w:val="0"/>
           <w:numId w:val="2"/>
         </w:numPr>
-        <w:jc w:val="both"/>
         <w:rPr>
           <w:rFonts w:eastAsiaTheme="minorEastAsia"/>
           <w:lang w:val="uk-UA" w:eastAsia="ru-RU"/>
@@ -3709,7 +3694,6 @@
           <w:ilvl w:val="0"/>
           <w:numId w:val="2"/>
         </w:numPr>
-        <w:jc w:val="both"/>
         <w:rPr>
           <w:rFonts w:eastAsiaTheme="minorEastAsia"/>
           <w:lang w:val="uk-UA" w:eastAsia="ru-RU"/>
@@ -3744,7 +3728,6 @@
           <w:ilvl w:val="0"/>
           <w:numId w:val="2"/>
         </w:numPr>
-        <w:jc w:val="both"/>
         <w:rPr>
           <w:rFonts w:eastAsiaTheme="minorEastAsia"/>
           <w:lang w:val="uk-UA" w:eastAsia="ru-RU"/>
@@ -3913,7 +3896,6 @@
           <w:ilvl w:val="0"/>
           <w:numId w:val="2"/>
         </w:numPr>
-        <w:jc w:val="both"/>
         <w:rPr>
           <w:rFonts w:eastAsiaTheme="minorEastAsia"/>
           <w:lang w:val="uk-UA" w:eastAsia="ru-RU"/>
@@ -3948,7 +3930,6 @@
     <w:p>
       <w:pPr>
         <w:ind w:firstLine="709"/>
-        <w:jc w:val="both"/>
         <w:rPr>
           <w:rFonts w:eastAsiaTheme="minorEastAsia"/>
           <w:lang w:val="uk-UA" w:eastAsia="ru-RU"/>
@@ -3990,7 +3971,6 @@
           <w:ilvl w:val="0"/>
           <w:numId w:val="2"/>
         </w:numPr>
-        <w:jc w:val="both"/>
         <w:rPr>
           <w:rFonts w:eastAsiaTheme="minorEastAsia"/>
           <w:lang w:val="uk-UA" w:eastAsia="ru-RU"/>
@@ -4064,7 +4044,6 @@
           <w:ilvl w:val="0"/>
           <w:numId w:val="2"/>
         </w:numPr>
-        <w:jc w:val="both"/>
         <w:rPr>
           <w:rFonts w:eastAsiaTheme="minorEastAsia"/>
           <w:lang w:val="uk-UA" w:eastAsia="ru-RU"/>
@@ -4145,7 +4124,6 @@
           <w:ilvl w:val="0"/>
           <w:numId w:val="2"/>
         </w:numPr>
-        <w:jc w:val="both"/>
         <w:rPr>
           <w:rFonts w:eastAsiaTheme="minorEastAsia"/>
           <w:lang w:val="uk-UA" w:eastAsia="ru-RU"/>
@@ -8820,7 +8798,6 @@
     <w:p>
       <w:pPr>
         <w:ind w:firstLine="708"/>
-        <w:jc w:val="both"/>
         <w:rPr>
           <w:lang w:val="uk-UA" w:eastAsia="ru-RU"/>
         </w:rPr>
@@ -8861,7 +8838,6 @@
     <w:p>
       <w:pPr>
         <w:ind w:firstLine="708"/>
-        <w:jc w:val="both"/>
         <w:rPr>
           <w:lang w:val="en-US" w:eastAsia="ru-RU"/>
         </w:rPr>
@@ -8979,7 +8955,7 @@
           <w:rPr>
             <w:noProof/>
           </w:rPr>
-          <w:t>6</w:t>
+          <w:t>7</w:t>
         </w:r>
         <w:r>
           <w:fldChar w:fldCharType="end"/>
@@ -9658,9 +9634,10 @@
   <w:style w:type="paragraph" w:default="1" w:styleId="a">
     <w:name w:val="Normal"/>
     <w:qFormat/>
-    <w:rsid w:val="009B0BF7"/>
+    <w:rsid w:val="0018798F"/>
     <w:pPr>
       <w:spacing w:after="0" w:line="360" w:lineRule="auto"/>
+      <w:jc w:val="both"/>
     </w:pPr>
     <w:rPr>
       <w:rFonts w:ascii="Times New Roman" w:hAnsi="Times New Roman"/>
@@ -10274,7 +10251,7 @@
 </file>
 
 <file path=customXml/itemProps1.xml><?xml version="1.0" encoding="utf-8"?>
-<ds:datastoreItem xmlns:ds="http://schemas.openxmlformats.org/officeDocument/2006/customXml" ds:itemID="{4039F844-99E6-4337-83F9-BBC21C1BE987}">
+<ds:datastoreItem xmlns:ds="http://schemas.openxmlformats.org/officeDocument/2006/customXml" ds:itemID="{FC7FA685-311A-485C-A58C-88384D49183C}">
   <ds:schemaRefs>
     <ds:schemaRef ds:uri="http://schemas.openxmlformats.org/officeDocument/2006/bibliography"/>
   </ds:schemaRefs>

</xml_diff>